<commit_message>
Revisione Pattern: Observer, Documentazione
</commit_message>
<xml_diff>
--- a/designPattern/observer/Observer.docx
+++ b/designPattern/observer/Observer.docx
@@ -117,6 +117,9 @@
     </w:p>
     <w:p>
       <w:r>
+        <w:rPr>
+          <w:noProof/>
+        </w:rPr>
         <w:drawing>
           <wp:inline distT="0" distB="0" distL="0" distR="0" wp14:anchorId="42476CED" wp14:editId="23FC3D41">
             <wp:extent cx="4958443" cy="2737757"/>
@@ -208,6 +211,9 @@
         <w:t xml:space="preserve"> </w:t>
       </w:r>
       <w:r>
+        <w:rPr>
+          <w:noProof/>
+        </w:rPr>
         <w:drawing>
           <wp:inline distT="0" distB="0" distL="0" distR="0" wp14:anchorId="2751DC68" wp14:editId="2C6FF260">
             <wp:extent cx="6120130" cy="3917950"/>
@@ -265,7 +271,7 @@
         <w:t>“invia”</w:t>
       </w:r>
       <w:r>
-        <w:t xml:space="preserve"> dell’oggetto per inviare la notifica, sarà poi l’oggetto stesso che propagherà il segnale a tutte le classi che decidono di osservarci, lui stesso saprà chi sono. Noi da Subject abbiamo solo il compito di notificare se il nostro cambiamento di stato.</w:t>
+        <w:t xml:space="preserve"> dell’oggetto per inviare la notifica, sarà poi l’oggetto stesso che propagherà il segnale a tutte le classi che decidono di osservarci, lui stesso saprà chi sono. Noi da Subject abbiamo solo il compito di notificare il nostro cambiamento di stato.</w:t>
       </w:r>
     </w:p>
     <w:p>
@@ -284,11 +290,28 @@
         <w:t xml:space="preserve">La classe </w:t>
       </w:r>
       <w:r>
+        <w:t>“</w:t>
+      </w:r>
+      <w:r>
         <w:rPr>
           <w:i/>
           <w:iCs/>
         </w:rPr>
-        <w:t xml:space="preserve">ServizioMail </w:t>
+        <w:t>ServizioMail</w:t>
+      </w:r>
+      <w:r>
+        <w:rPr>
+          <w:i/>
+          <w:iCs/>
+        </w:rPr>
+        <w:t>”</w:t>
+      </w:r>
+      <w:r>
+        <w:rPr>
+          <w:i/>
+          <w:iCs/>
+        </w:rPr>
+        <w:t xml:space="preserve"> </w:t>
       </w:r>
       <w:r>
         <w:t>è definita come segue:</w:t>
@@ -300,6 +323,9 @@
         <w:t xml:space="preserve"> </w:t>
       </w:r>
       <w:r>
+        <w:rPr>
+          <w:noProof/>
+        </w:rPr>
         <w:drawing>
           <wp:inline distT="0" distB="0" distL="0" distR="0" wp14:anchorId="28EB1E1C" wp14:editId="4D212B17">
             <wp:extent cx="6120130" cy="4595495"/>
@@ -493,7 +519,7 @@
         <w:rPr>
           <w:noProof/>
         </w:rPr>
-        <w:t>Questa implementazione così semplice però ci ancora al fatto che i nostri clienti verranno notificati soltanto via mail e soltanto per l’arrivo di nuova merce, quindi non verranno notificati tramite l’applicazione del cellulare ad esempio oppure per degli sconti nel negozio. Per fare ciò dobbiamo modificare leggerlemente la nostra implementazione per creare più Observer, quello della mail e quello dell’applicazione e soprattutto più cambiamenti di stato come ad esempio un nuovo sconto oltre all’arrivo di sola merce.</w:t>
+        <w:t>Questa implementazione così semplice però ci ancora al fatto che i nostri clienti verranno notificati soltanto via mail e soltanto per l’arrivo di nuova merce, quindi non verranno notificati tramite l’applicazione del cellulare ad esempio oppure per degli sconti nel negozio. Per fare ciò dobbiamo modificare leggermente la nostra implementazione per creare più Observer, quello della mail e quello dell’applicazione e soprattutto più cambiamenti di stato come ad esempio un nuovo sconto oltre all’arrivo di sola merce.</w:t>
       </w:r>
     </w:p>
     <w:p>
@@ -800,6 +826,21 @@
           <w:noProof/>
         </w:rPr>
         <w:t>Ora tutti i clienti verrano avvisati in base al metodo di notifica pereferito.</w:t>
+      </w:r>
+    </w:p>
+    <w:p>
+      <w:pPr>
+        <w:rPr>
+          <w:noProof/>
+        </w:rPr>
+      </w:pPr>
+      <w:r>
+        <w:rPr>
+          <w:b/>
+          <w:bCs/>
+          <w:noProof/>
+        </w:rPr>
+        <w:t>IMPLEMENTAZIONE CON STATI E OBSERVER MULTIPLI</w:t>
       </w:r>
     </w:p>
     <w:p>
@@ -2093,6 +2134,7 @@
   <w:style w:type="character" w:default="1" w:styleId="Carpredefinitoparagrafo">
     <w:name w:val="Default Paragraph Font"/>
     <w:uiPriority w:val="1"/>
+    <w:semiHidden/>
     <w:unhideWhenUsed/>
   </w:style>
   <w:style w:type="table" w:default="1" w:styleId="Tabellanormale">

</xml_diff>